<commit_message>
fix(nd30-forms): ẩn thông tin nhạy cảm trong ví dụ biên bản họp
- 14 tên cá nhân (EVN, PVPower, Thứ trưởng) -> [Họ tên ...]
- Tên hai bên EVN/PVPower, mã cổ phiếu POW -> [Tên Bên A/B], [Mã CK]
- Số hợp đồng 01/ĐLDKCM-EVN-2008 -> chỗ trống
- Ngày họp 14/11/2019, địa chỉ trụ sở EVN -> ..
- Xóa tác giả metadata (dc:creator, cp:lastModifiedBy)
- Giữ nguyên văn bản quy định công khai (Thông tư 56/2014, TB 220/TB-BCT, CV 2157) và số liệu đã công bố
</commit_message>
<xml_diff>
--- a/skills/nd30-forms/examples/docx-mau-bien-ban-hop.docx
+++ b/skills/nd30-forms/examples/docx-mau-bien-ban-hop.docx
@@ -227,7 +227,7 @@
           <w:szCs w:val="28"/>
           <w:lang w:val="pt-BR"/>
         </w:rPr>
-        <w:t xml:space="preserve"> N</w:t>
+        <w:t xml:space="preserve"> Ngày .../.../....</w:t>
       </w:r>
       <w:r>
         <w:rPr>
@@ -237,7 +237,7 @@
           <w:szCs w:val="28"/>
           <w:lang w:val="pt-BR"/>
         </w:rPr>
-        <w:t>gày 14/11/2019</w:t>
+        <w:t/>
       </w:r>
     </w:p>
     <w:p>
@@ -290,7 +290,7 @@
           <w:szCs w:val="28"/>
           <w:lang w:val="pt-BR"/>
         </w:rPr>
-        <w:t>Trụ sở Tập đoàn Điện lực Việt Nam, tầng 4 tòa nhà EVN, số 11 phố Cửa Bắc, phường Trúc Bạch, Quận Ba Đình, Thành phố Hà Nội .</w:t>
+        <w:t>Trụ sở [Tên Bên A], Thành phố Hà Nội .</w:t>
       </w:r>
     </w:p>
     <w:p>
@@ -338,7 +338,7 @@
           <w:szCs w:val="28"/>
           <w:lang w:val="pt-BR"/>
         </w:rPr>
-        <w:t>Tập đoàn Điện lực Việt Nam (EVN)</w:t>
+        <w:t>[Tên Bên A]</w:t>
       </w:r>
     </w:p>
     <w:p>
@@ -368,7 +368,7 @@
           <w:szCs w:val="28"/>
           <w:lang w:val="pt-BR"/>
         </w:rPr>
-        <w:t>Ông Trần Đình Nhân</w:t>
+        <w:t>Ông [Họ tên A1]</w:t>
       </w:r>
       <w:r>
         <w:rPr>
@@ -416,7 +416,7 @@
           <w:szCs w:val="28"/>
           <w:lang w:val="pt-BR"/>
         </w:rPr>
-        <w:t>Ông Ngô Sơn Hải</w:t>
+        <w:t>Ông [Họ tên A2]</w:t>
       </w:r>
       <w:r>
         <w:rPr>
@@ -464,7 +464,7 @@
           <w:szCs w:val="28"/>
           <w:lang w:val="pt-BR"/>
         </w:rPr>
-        <w:t>Ông Trần Đăng Khoa</w:t>
+        <w:t>Ông [Họ tên A3]</w:t>
       </w:r>
       <w:r>
         <w:rPr>
@@ -512,7 +512,7 @@
           <w:szCs w:val="28"/>
           <w:lang w:val="pt-BR"/>
         </w:rPr>
-        <w:t>Ông Lê Hồng Lĩnh</w:t>
+        <w:t>Ông [Họ tên A4]</w:t>
       </w:r>
       <w:r>
         <w:rPr>
@@ -560,7 +560,7 @@
           <w:szCs w:val="28"/>
           <w:lang w:val="pt-BR"/>
         </w:rPr>
-        <w:t>Ông Vũ Xuân Khu</w:t>
+        <w:t>Ông [Họ tên A5]</w:t>
       </w:r>
       <w:r>
         <w:rPr>
@@ -608,7 +608,7 @@
           <w:szCs w:val="28"/>
           <w:lang w:val="pt-BR"/>
         </w:rPr>
-        <w:t>Ông Nguyễn Danh Sơn</w:t>
+        <w:t>Ông [Họ tên A6]</w:t>
       </w:r>
       <w:r>
         <w:rPr>
@@ -654,7 +654,7 @@
           <w:szCs w:val="28"/>
           <w:lang w:val="pt-BR"/>
         </w:rPr>
-        <w:t>Tổng Công ty Điện lực Dầu khí Việt Nam – Công ty cổ phần (PVPower)</w:t>
+        <w:t>[Tên Bên B]</w:t>
       </w:r>
     </w:p>
     <w:p>
@@ -683,7 +683,7 @@
           <w:szCs w:val="28"/>
           <w:lang w:val="pt-BR"/>
         </w:rPr>
-        <w:t>Ông Hồ Công Kỳ</w:t>
+        <w:t>Ông [Họ tên B1]</w:t>
       </w:r>
       <w:r>
         <w:rPr>
@@ -730,7 +730,7 @@
           <w:szCs w:val="28"/>
           <w:lang w:val="pt-BR"/>
         </w:rPr>
-        <w:t>Ông Lê Như Linh</w:t>
+        <w:t>Ông [Họ tên B2]</w:t>
       </w:r>
       <w:r>
         <w:rPr>
@@ -777,7 +777,7 @@
           <w:szCs w:val="28"/>
           <w:lang w:val="pt-BR"/>
         </w:rPr>
-        <w:t>Bà Vũ Thị Tố Nga</w:t>
+        <w:t>Bà [Họ tên B3]</w:t>
       </w:r>
       <w:r>
         <w:rPr>
@@ -824,7 +824,7 @@
           <w:szCs w:val="28"/>
           <w:lang w:val="pt-BR"/>
         </w:rPr>
-        <w:t xml:space="preserve">Ông Phan Đại Thành         </w:t>
+        <w:t xml:space="preserve">Ông [Họ tên B4]         </w:t>
       </w:r>
       <w:r>
         <w:rPr>
@@ -871,7 +871,7 @@
           <w:szCs w:val="28"/>
           <w:lang w:val="pt-BR"/>
         </w:rPr>
-        <w:t xml:space="preserve">Ông Chu Quang Toản </w:t>
+        <w:t xml:space="preserve">Ông [Họ tên B5] </w:t>
       </w:r>
       <w:r>
         <w:rPr>
@@ -918,7 +918,7 @@
           <w:szCs w:val="28"/>
           <w:lang w:val="pt-BR"/>
         </w:rPr>
-        <w:t xml:space="preserve">Bà Phạm Ngọc Vi Hiền     </w:t>
+        <w:t xml:space="preserve">Bà [Họ tên B6]     </w:t>
       </w:r>
       <w:r>
         <w:rPr>
@@ -965,7 +965,7 @@
           <w:szCs w:val="28"/>
           <w:lang w:val="pt-BR"/>
         </w:rPr>
-        <w:t>Bà Võ Thị Tú Oanh             Phó trưởng Ban Pháp chế &amp;QHCĐ.</w:t>
+        <w:t>Bà [Họ tên B7]             Phó trưởng Ban Pháp chế &amp;QHCĐ.</w:t>
       </w:r>
     </w:p>
     <w:p>
@@ -1010,7 +1010,7 @@
           <w:szCs w:val="28"/>
           <w:lang w:val="pt-BR"/>
         </w:rPr>
-        <w:t>EVN và PV Power nêu ý kiến hai bên về các vướng mắc trong quá trình chuyển đổi Hợp đồng mua bán điện hiện hữu của Nhà máy điện Cà Mau 1&amp;2 sang hợp đồng mua bán điện dạng sai khác (CfD) để tham gia thị trường điện cạnh tranh, cụ thể như sau:</w:t>
+        <w:t>[Tên Bên A] và [Tên Bên B] nêu ý kiến hai bên về các vướng mắc trong quá trình chuyển đổi Hợp đồng mua bán điện hiện hữu của Nhà máy điện Cà Mau 1&amp;2 sang hợp đồng mua bán điện dạng sai khác (CfD) để tham gia thị trường điện cạnh tranh, cụ thể như sau:</w:t>
       </w:r>
     </w:p>
     <w:p>
@@ -1037,7 +1037,7 @@
           <w:szCs w:val="28"/>
           <w:lang w:val="pt-BR"/>
         </w:rPr>
-        <w:t>I. Ý kiến của EVN</w:t>
+        <w:t>I. Ý kiến của [Tên Bên A]</w:t>
       </w:r>
     </w:p>
     <w:p>
@@ -1069,7 +1069,7 @@
           <w:szCs w:val="28"/>
           <w:lang w:val="vi-VN"/>
         </w:rPr>
-        <w:t>số 01/ĐLDKCM-EVN-2008</w:t>
+        <w:t>số ......../...........-..........</w:t>
       </w:r>
       <w:r>
         <w:rPr>
@@ -1096,7 +1096,7 @@
           <w:szCs w:val="28"/>
           <w:lang w:val="vi-VN"/>
         </w:rPr>
-        <w:t>số 01/ĐLDKCM-EVN-2008</w:t>
+        <w:t>số ......../...........-..........</w:t>
       </w:r>
       <w:r>
         <w:rPr>
@@ -1230,7 +1230,7 @@
           <w:szCs w:val="28"/>
           <w:lang w:val="pl-PL"/>
         </w:rPr>
-        <w:t>II. Ý kiến của PV Power</w:t>
+        <w:t>II. Ý kiến của [Tên Bên B]</w:t>
       </w:r>
     </w:p>
     <w:p>
@@ -1342,7 +1342,7 @@
           <w:szCs w:val="28"/>
           <w:lang w:val="pl-PL"/>
         </w:rPr>
-        <w:t>Trên cơ sở quy định tại khoản 1, Điều 16 như trên và thực hiện ý kiến của Thứ trưởng Hoàng Quốc Vượng theo thông báo số 220/TB-BCT ngày 16/9/2019, PV Power kiến nghị chuyển đổi Hợp đồng mua bán điện như sau:</w:t>
+        <w:t>Trên cơ sở quy định tại khoản 1, Điều 16 như trên và thực hiện ý kiến của Thứ trưởng [Họ tên C1] theo thông báo số 220/TB-BCT ngày 16/9/2019, [Tên Bên B] kiến nghị chuyển đổi Hợp đồng mua bán điện như sau:</w:t>
       </w:r>
     </w:p>
     <w:p>
@@ -1496,7 +1496,7 @@
           <w:szCs w:val="28"/>
           <w:lang w:val="pt-BR"/>
         </w:rPr>
-        <w:t xml:space="preserve">2. Phương án cổ phần hóa PV Power bao gồm kế hoạch sản xuất kinh doanh sau cổ phần hóa được xây dựng trên cơ sở các Hợp đồng mua bán điện đã ký. Theo đó, đối với Nhà máy điện Cà Mau 1&amp;2, phí công suất là 5,275 USD/kW/tháng, tỷ giá quy đổi VNĐ/USD năm 2018 là 22.950, tỷ giá tăng 2%/năm. Phương án cổ phần hóa với các yếu tố trên được các nhà đầu tư tin tưởng, mua 14.894 đồng/cổ phiếu POW, thu về cho ngân sách Nhà nước 2.300 tỷ đồng thặng dư. Vì vậy, bất kỳ sự điều chỉnh nào phá vỡ phương án Cổ phần hóa PV Power đã được Chính phủ phê duyệt như </w:t>
+        <w:t xml:space="preserve">2. Phương án cổ phần hóa [Tên Bên B] bao gồm kế hoạch sản xuất kinh doanh sau cổ phần hóa được xây dựng trên cơ sở các Hợp đồng mua bán điện đã ký. Theo đó, đối với Nhà máy điện Cà Mau 1&amp;2, phí công suất là 5,275 USD/kW/tháng, tỷ giá quy đổi VNĐ/USD năm 2018 là 22.950, tỷ giá tăng 2%/năm. Phương án cổ phần hóa với các yếu tố trên được các nhà đầu tư tin tưởng, mua 14.894 đồng/cổ phiếu [Mã CK], thu về cho ngân sách Nhà nước 2.300 tỷ đồng thặng dư. Vì vậy, bất kỳ sự điều chỉnh nào phá vỡ phương án Cổ phần hóa [Tên Bên B] đã được Chính phủ phê duyệt như </w:t>
       </w:r>
       <w:r>
         <w:rPr>
@@ -1515,7 +1515,7 @@
           <w:szCs w:val="28"/>
           <w:lang w:val="pt-BR"/>
         </w:rPr>
-        <w:t xml:space="preserve"> đều là phá vỡ cam kết của Chính phủ với nhà đầu tư, ảnh hưởng xấu tới uy tín quốc gia và có thể làm mất vốn Nhà nước tại PV Power.</w:t>
+        <w:t xml:space="preserve"> đều là phá vỡ cam kết của Chính phủ với nhà đầu tư, ảnh hưởng xấu tới uy tín quốc gia và có thể làm mất vốn Nhà nước tại [Tên Bên B].</w:t>
       </w:r>
       <w:r>
         <w:rPr>
@@ -1641,7 +1641,7 @@
                 <w:szCs w:val="28"/>
                 <w:lang w:val="es-ES"/>
               </w:rPr>
-              <w:t>ĐẠI DIỆN EVN</w:t>
+              <w:t>ĐẠI DIỆN [Tên Bên A]</w:t>
             </w:r>
           </w:p>
           <w:p>
@@ -1745,7 +1745,7 @@
                 <w:szCs w:val="28"/>
                 <w:lang w:val="pl-PL"/>
               </w:rPr>
-              <w:t>Trần Đình Nhân</w:t>
+              <w:t>[Họ tên A1]</w:t>
             </w:r>
           </w:p>
         </w:tc>
@@ -1774,7 +1774,7 @@
                 <w:szCs w:val="28"/>
                 <w:lang w:val="es-ES"/>
               </w:rPr>
-              <w:t xml:space="preserve">ĐẠI DIỆN PVPOWER </w:t>
+              <w:t xml:space="preserve">ĐẠI DIỆN [Tên Bên B] </w:t>
             </w:r>
           </w:p>
           <w:p>
@@ -1878,7 +1878,7 @@
                 <w:szCs w:val="28"/>
                 <w:lang w:val="es-ES"/>
               </w:rPr>
-              <w:t>Lê Như Linh</w:t>
+              <w:t>[Họ tên B2]</w:t>
             </w:r>
           </w:p>
         </w:tc>

</xml_diff>